<commit_message>
v2.30 (John's word, 13 October): Sessions 9-10 teach testing what you hear, before the garden
From the Four Connects deck (Sept 2025), "Hearing God - The How" and "What If?":
two new slides after the check-in (When have you heard God? / How did you know?
- the room's answers first, then the checks: Scripture first, sense, the Spirit's
witness, peace, company, circumstances, obedience over time); "notice, don't
conclude" on the bridge; two test lines after each garden return. Clock re-timed
to 90 minutes (check-in and framing trimmed; garden keeps 32). New one-page
How Did You Know? card (H9.4) synced beside the take-home; Session 9 take-home
filled in, preparation sentence points to Any Doubts?. The "silent place"
exercise is saved for Session 11. Leader notes rebuilt; run sheet two pages.

Co-Authored-By: Claude Opus 5.5 <noreply@anthropic.com>
</commit_message>
<xml_diff>
--- a/_implementation-notes/evening-series/FotH Evening Session 9-10 Combined Leader Notes DRAFT v1.docx
+++ b/_implementation-notes/evening-series/FotH Evening Session 9-10 Combined Leader Notes DRAFT v1.docx
@@ -45,7 +45,7 @@
           <w:color w:val="595959"/>
           <w:sz w:val="18"/>
         </w:rPr>
-        <w:t>Match the big number on each block to the number in the bottom-right corner of the screen. This is a combined evening, so its slides are numbered with a letter: G2–G15. The letter keeps this deck outside the series' one continuous numbering; the separate two-evening versions of these sessions, held in reserve, keep the plain series numbers. The first slide, the series title, is “Title” here.</w:t>
+        <w:t>Match the big number on each block to the number in the bottom-right corner of the screen. This is a combined evening, so its slides are numbered with a letter: G2–G17. The letter keeps this deck outside the series' one continuous numbering; the separate two-evening versions of these sessions, held in reserve, keep the plain series numbers. The first slide, the series title, is “Title” here.</w:t>
       </w:r>
     </w:p>
     <w:p>
@@ -147,7 +147,7 @@
           <w:color w:val="7F7F7F"/>
           <w:sz w:val="16"/>
         </w:rPr>
-        <w:t xml:space="preserve">   · slide 1 of 15</w:t>
+        <w:t xml:space="preserve">   · slide 1 of 17</w:t>
       </w:r>
     </w:p>
     <w:p>
@@ -219,7 +219,7 @@
           <w:color w:val="7F7F7F"/>
           <w:sz w:val="16"/>
         </w:rPr>
-        <w:t xml:space="preserve">   · slide 2 of 15</w:t>
+        <w:t xml:space="preserve">   · slide 2 of 17</w:t>
       </w:r>
     </w:p>
     <w:p>
@@ -291,7 +291,7 @@
           <w:color w:val="7F7F7F"/>
           <w:sz w:val="16"/>
         </w:rPr>
-        <w:t xml:space="preserve">   · slide 3 of 15</w:t>
+        <w:t xml:space="preserve">   · slide 3 of 17</w:t>
       </w:r>
     </w:p>
     <w:p>
@@ -434,7 +434,7 @@
           <w:color w:val="7F7F7F"/>
           <w:sz w:val="16"/>
         </w:rPr>
-        <w:t xml:space="preserve">   · slide 4 of 15</w:t>
+        <w:t xml:space="preserve">   · slide 4 of 17</w:t>
       </w:r>
     </w:p>
     <w:p>
@@ -503,7 +503,7 @@
         <w:spacing w:before="0" w:after="60"/>
       </w:pPr>
       <w:r>
-        <w:t>2. Shape: open, check-in, Scripture and framing (John 15; Psalm 23), bridge and settle, the guided run — a senior reads the walk-through, two words per second, the pauses are where the work happens; adults hold the sharing — journaling, pair sharing by invitation, merge, the returns commissioned, feedback, gentle close.</w:t>
+        <w:t>2. Shape: open, a short check-in, remembering a real hearing and how we knew (the tests, before the garden), Scripture and framing (John 15; Psalm 23), bridge and settle, the guided run — a senior reads the walk-through, two words per second, the pauses are where the work happens; adults hold the sharing — journaling, pair sharing by invitation, merge, the returns commissioned, feedback, gentle close.</w:t>
       </w:r>
     </w:p>
     <w:p>
@@ -515,6 +515,17 @@
       </w:pPr>
       <w:r>
         <w:t>3. The current-condition form: teen-led from the first run. The separate second-running evening (Session 10) is held in reserve for a larger room of newer people.</w:t>
+      </w:r>
+    </w:p>
+    <w:p>
+      <w:pPr>
+        <w:pBdr>
+          <w:left w:val="thickThinSmallGap" w:sz="24" w:space="8" w:color="6B3FA0"/>
+        </w:pBdr>
+        <w:spacing w:before="0" w:after="60"/>
+      </w:pPr>
+      <w:r>
+        <w:t>4. Why the testing comes first (John's word, 13 October): what anyone notices in the garden is held loosely and tested on the returns, not concluded tonight. Session 11, Any Doubts?, starts from here.</w:t>
       </w:r>
     </w:p>
     <w:p>
@@ -576,7 +587,7 @@
           <w:color w:val="7F7F7F"/>
           <w:sz w:val="16"/>
         </w:rPr>
-        <w:t xml:space="preserve">   · slide 5 of 15</w:t>
+        <w:t xml:space="preserve">   · slide 5 of 17</w:t>
       </w:r>
     </w:p>
     <w:p>
@@ -593,7 +604,7 @@
           <w:color w:val="6B8E3F"/>
           <w:sz w:val="18"/>
         </w:rPr>
-        <w:t xml:space="preserve">S9 · 7:00–7:08 · </w:t>
+        <w:t xml:space="preserve">S9 · 7:00–7:06 · </w:t>
       </w:r>
       <w:r>
         <w:rPr>
@@ -688,7 +699,7 @@
           <w:color w:val="7F7F7F"/>
           <w:sz w:val="16"/>
         </w:rPr>
-        <w:t xml:space="preserve">   · slide 6 of 15</w:t>
+        <w:t xml:space="preserve">   · slide 6 of 17</w:t>
       </w:r>
     </w:p>
     <w:p>
@@ -705,7 +716,7 @@
           <w:color w:val="6B8E3F"/>
           <w:sz w:val="18"/>
         </w:rPr>
-        <w:t xml:space="preserve">S9 · 7:08–7:25 · </w:t>
+        <w:t xml:space="preserve">S9 · 7:06–7:10 · </w:t>
       </w:r>
       <w:r>
         <w:rPr>
@@ -738,7 +749,7 @@
         <w:t xml:space="preserve">BEATS: </w:t>
       </w:r>
       <w:r>
-        <w:t>1. One sentence each on how the daily PROAPT practice has been. 2. Take 2–3 voluntary contributions and keep it brief — today's arc needs the time later.</w:t>
+        <w:t>1. One sentence each on how the daily PROAPT practice has been. 2. Two voluntary contributions, kept brief — four minutes; tonight's arc needs the time.</w:t>
       </w:r>
     </w:p>
     <w:p>
@@ -784,7 +795,7 @@
           <w:color w:val="2C5F2D"/>
           <w:sz w:val="24"/>
         </w:rPr>
-        <w:t xml:space="preserve">   Scripture and Framing</w:t>
+        <w:t xml:space="preserve">   When Have You Really Heard?</w:t>
       </w:r>
       <w:r>
         <w:rPr>
@@ -800,7 +811,7 @@
           <w:color w:val="7F7F7F"/>
           <w:sz w:val="16"/>
         </w:rPr>
-        <w:t xml:space="preserve">   · slide 7 of 15</w:t>
+        <w:t xml:space="preserve">   · slide 7 of 17</w:t>
       </w:r>
     </w:p>
     <w:p>
@@ -817,7 +828,7 @@
           <w:color w:val="6B8E3F"/>
           <w:sz w:val="18"/>
         </w:rPr>
-        <w:t xml:space="preserve">S9 · 7:25–7:40 · </w:t>
+        <w:t xml:space="preserve">S9 · 7:10–7:20 · </w:t>
       </w:r>
       <w:r>
         <w:rPr>
@@ -850,7 +861,61 @@
         <w:t xml:space="preserve">BEATS: </w:t>
       </w:r>
       <w:r>
-        <w:t>1. Read Psalm 23 and John 15:1–11 slowly — 'listen as if you have not heard it.' 2. Teach: scripture pictures the heart as cultivated ground; today we walk into that image and invite Jesus in to walk it with us. 3. Name the lineage — imaginative prayer: Ignatius, Bonaventure, the Puritans — and the two nots: not visualization-as-self-help, not emptying the mind. 4. 'Vivid experience or nothing at all — both fine. The turning toward Him is the practice.' 5. If you sense resistance, read the skepticism paragraph — the frame IS the work; do not skip it.</w:t>
+        <w:t>1. Frame, 30 seconds: 'Before we go into the garden, we remember a time we really heard — and how we knew. Next time is Any Doubts?; this is the ground under it.' 2. A leader tells first, arranged beforehand: two or three plain sentences — a real time you heard, how you knew, what you did. 3. Quiet recall, 3 minutes, journals open: when and where, what was going on, what it looked, sounded or felt like, what you heard, what you did with it. Make it fuller as you write. 4. Pairs, 4 minutes, by invitation: the partner asks only one question — 'How did you know?' — and listens.</w:t>
+      </w:r>
+    </w:p>
+    <w:p>
+      <w:pPr>
+        <w:pBdr>
+          <w:left w:val="double" w:sz="12" w:space="8" w:color="B45309"/>
+        </w:pBdr>
+        <w:spacing w:before="0" w:after="60"/>
+      </w:pPr>
+      <w:r>
+        <w:rPr>
+          <w:b/>
+          <w:color w:val="595959"/>
+        </w:rPr>
+        <w:t xml:space="preserve">CUES: </w:t>
+      </w:r>
+      <w:r>
+        <w:t>Never cold-call a teen; pass-anytime holds. 'I can't think of one' is an honest answer — offer the creation door (Rom. 1:20) or a time you simply knew something was true. Keep the answers to 'How did you know?' for the next slide.</w:t>
+      </w:r>
+    </w:p>
+    <w:p>
+      <w:pPr>
+        <w:pBdr>
+          <w:left w:val="double" w:sz="12" w:space="8" w:color="B45309"/>
+        </w:pBdr>
+        <w:spacing w:before="0" w:after="60"/>
+      </w:pPr>
+      <w:r>
+        <w:rPr>
+          <w:b/>
+          <w:color w:val="595959"/>
+        </w:rPr>
+        <w:t xml:space="preserve">GUARD: </w:t>
+      </w:r>
+      <w:r>
+        <w:t>This is remembering, not judging — no one rules on whether another person's hearing was God. If a memory turns heavy, the Settle Protocol stands.</w:t>
+      </w:r>
+    </w:p>
+    <w:p>
+      <w:pPr>
+        <w:pBdr>
+          <w:left w:val="double" w:sz="12" w:space="8" w:color="B45309"/>
+        </w:pBdr>
+        <w:spacing w:before="0" w:after="60"/>
+      </w:pPr>
+      <w:r>
+        <w:rPr>
+          <w:b/>
+          <w:color w:val="595959"/>
+        </w:rPr>
+        <w:t xml:space="preserve">FROM: </w:t>
+      </w:r>
+      <w:r>
+        <w:t>the Four Connects deck (FotH, September 2025), 'Hearing God — The How': remember a time of hearing, see it, hear it, feel it, make it fuller, anchor it.</w:t>
       </w:r>
     </w:p>
     <w:p>
@@ -878,6 +943,248 @@
           <w:color w:val="2C5F2D"/>
           <w:sz w:val="24"/>
         </w:rPr>
+        <w:t xml:space="preserve">   How Did You Know? — Testing What You Hear</w:t>
+      </w:r>
+      <w:r>
+        <w:rPr>
+          <w:b/>
+          <w:color w:val="B45309"/>
+          <w:sz w:val="17"/>
+        </w:rPr>
+        <w:t xml:space="preserve">    CONTENT PRESENTER</w:t>
+      </w:r>
+      <w:r>
+        <w:rPr>
+          <w:b w:val="0"/>
+          <w:color w:val="7F7F7F"/>
+          <w:sz w:val="16"/>
+        </w:rPr>
+        <w:t xml:space="preserve">   · slide 8 of 17</w:t>
+      </w:r>
+    </w:p>
+    <w:p>
+      <w:pPr>
+        <w:keepNext/>
+        <w:pBdr>
+          <w:left w:val="double" w:sz="12" w:space="8" w:color="B45309"/>
+        </w:pBdr>
+        <w:spacing w:before="0" w:after="60"/>
+      </w:pPr>
+      <w:r>
+        <w:rPr>
+          <w:b/>
+          <w:color w:val="6B8E3F"/>
+          <w:sz w:val="18"/>
+        </w:rPr>
+        <w:t xml:space="preserve">S9 · 7:20–7:25 · </w:t>
+      </w:r>
+      <w:r>
+        <w:rPr>
+          <w:b/>
+          <w:color w:val="B45309"/>
+          <w:sz w:val="18"/>
+        </w:rPr>
+        <w:t>LEAD: CONTENT PRESENTER</w:t>
+      </w:r>
+      <w:r>
+        <w:rPr>
+          <w:b/>
+          <w:color w:val="6B8E3F"/>
+          <w:sz w:val="18"/>
+        </w:rPr>
+      </w:r>
+    </w:p>
+    <w:p>
+      <w:pPr>
+        <w:pBdr>
+          <w:left w:val="double" w:sz="12" w:space="8" w:color="B45309"/>
+        </w:pBdr>
+        <w:spacing w:before="0" w:after="60"/>
+      </w:pPr>
+      <w:r>
+        <w:rPr>
+          <w:b/>
+          <w:color w:val="595959"/>
+        </w:rPr>
+        <w:t xml:space="preserve">BEATS: </w:t>
+      </w:r>
+      <w:r>
+        <w:t>1. The room round, 2 minutes: 'How did you know?' Collect the answers aloud; the container holder writes them on a sheet. 2. Then the slide: line the room's answers up with the checks — most will already be there. Name any the room found that the slide does not have; they count. 3. Scripture first: it is the court, and the others confirm. No one check is enough on its own — and peace can be faked by wanting something badly. 4. Obedience: 'What happened when you obeyed?' Obeying what you hear opens you to hear more. 5. Bridge: 'Tonight in the garden, notice — don't conclude. On your returns you will test what you noticed. The card in your take-home has these checks.'</w:t>
+      </w:r>
+    </w:p>
+    <w:p>
+      <w:pPr>
+        <w:pBdr>
+          <w:left w:val="double" w:sz="12" w:space="8" w:color="B45309"/>
+        </w:pBdr>
+        <w:spacing w:before="0" w:after="60"/>
+      </w:pPr>
+      <w:r>
+        <w:rPr>
+          <w:b/>
+          <w:color w:val="595959"/>
+        </w:rPr>
+        <w:t xml:space="preserve">CUES: </w:t>
+      </w:r>
+      <w:r>
+        <w:t>A practice, not a lecture — the room's list leads and the slide confirms. Five minutes; the garden needs its time.</w:t>
+      </w:r>
+    </w:p>
+    <w:p>
+      <w:pPr>
+        <w:pBdr>
+          <w:left w:val="double" w:sz="12" w:space="8" w:color="B45309"/>
+        </w:pBdr>
+        <w:spacing w:before="0" w:after="60"/>
+      </w:pPr>
+      <w:r>
+        <w:rPr>
+          <w:b/>
+          <w:color w:val="595959"/>
+        </w:rPr>
+        <w:t xml:space="preserve">GUARD: </w:t>
+      </w:r>
+      <w:r>
+        <w:t>No one tests someone else's hearing aloud tonight. Each person tests their own, in company they choose.</w:t>
+      </w:r>
+    </w:p>
+    <w:p>
+      <w:pPr>
+        <w:pBdr>
+          <w:left w:val="double" w:sz="12" w:space="8" w:color="B45309"/>
+        </w:pBdr>
+        <w:spacing w:before="0" w:after="60"/>
+      </w:pPr>
+      <w:r>
+        <w:rPr>
+          <w:b/>
+          <w:color w:val="595959"/>
+        </w:rPr>
+        <w:t xml:space="preserve">FROM: </w:t>
+      </w:r>
+      <w:r>
+        <w:t>the Four Connects deck (FotH, September 2025), 'Hearing God — What If?': how do you know something is from the Lord? It lines up with Scripture, reason, the witness of the Spirit, peace, community, circumstances.</w:t>
+      </w:r>
+    </w:p>
+    <w:p>
+      <w:pPr>
+        <w:keepNext/>
+        <w:pBdr>
+          <w:left w:val="double" w:sz="12" w:space="8" w:color="B45309"/>
+        </w:pBdr>
+        <w:shd w:val="clear" w:color="auto" w:fill="FCE9D6"/>
+        <w:spacing w:before="160" w:after="40"/>
+      </w:pPr>
+      <w:r>
+        <w:rPr>
+          <w:rFonts w:ascii="Cambria" w:hAnsi="Cambria"/>
+          <w:b/>
+          <w:color w:val="B45309"/>
+          <w:sz w:val="30"/>
+        </w:rPr>
+        <w:t>G9</w:t>
+      </w:r>
+      <w:r>
+        <w:rPr>
+          <w:rFonts w:ascii="Cambria" w:hAnsi="Cambria"/>
+          <w:b/>
+          <w:color w:val="2C5F2D"/>
+          <w:sz w:val="24"/>
+        </w:rPr>
+        <w:t xml:space="preserve">   Scripture and Framing</w:t>
+      </w:r>
+      <w:r>
+        <w:rPr>
+          <w:b/>
+          <w:color w:val="B45309"/>
+          <w:sz w:val="17"/>
+        </w:rPr>
+        <w:t xml:space="preserve">    CONTENT PRESENTER</w:t>
+      </w:r>
+      <w:r>
+        <w:rPr>
+          <w:b w:val="0"/>
+          <w:color w:val="7F7F7F"/>
+          <w:sz w:val="16"/>
+        </w:rPr>
+        <w:t xml:space="preserve">   · slide 9 of 17</w:t>
+      </w:r>
+    </w:p>
+    <w:p>
+      <w:pPr>
+        <w:keepNext/>
+        <w:pBdr>
+          <w:left w:val="double" w:sz="12" w:space="8" w:color="B45309"/>
+        </w:pBdr>
+        <w:spacing w:before="0" w:after="60"/>
+      </w:pPr>
+      <w:r>
+        <w:rPr>
+          <w:b/>
+          <w:color w:val="6B8E3F"/>
+          <w:sz w:val="18"/>
+        </w:rPr>
+        <w:t xml:space="preserve">S9 · 7:25–7:31 · </w:t>
+      </w:r>
+      <w:r>
+        <w:rPr>
+          <w:b/>
+          <w:color w:val="B45309"/>
+          <w:sz w:val="18"/>
+        </w:rPr>
+        <w:t>LEAD: CONTENT PRESENTER</w:t>
+      </w:r>
+      <w:r>
+        <w:rPr>
+          <w:b/>
+          <w:color w:val="6B8E3F"/>
+          <w:sz w:val="18"/>
+        </w:rPr>
+      </w:r>
+    </w:p>
+    <w:p>
+      <w:pPr>
+        <w:pBdr>
+          <w:left w:val="double" w:sz="12" w:space="8" w:color="B45309"/>
+        </w:pBdr>
+        <w:spacing w:before="0" w:after="60"/>
+      </w:pPr>
+      <w:r>
+        <w:rPr>
+          <w:b/>
+          <w:color w:val="595959"/>
+        </w:rPr>
+        <w:t xml:space="preserve">BEATS: </w:t>
+      </w:r>
+      <w:r>
+        <w:t>1. Read John 15:1–11 slowly, then Psalm 23:1–3 — 'listen as if you have not heard it.' 2. Teach: scripture pictures the heart as cultivated ground; today we walk into that image and invite Jesus in to walk it with us. 3. Name the lineage in a sentence — imaginative prayer: Ignatius, Bonaventure, the Puritans — and the two nots: not visualization-as-self-help, not emptying the mind. 4. 'Vivid experience or nothing at all — both fine. The turning toward Him is the practice.' 5. If you sense resistance, read the skepticism paragraph — the frame IS the work; do not skip it.</w:t>
+      </w:r>
+    </w:p>
+    <w:p>
+      <w:pPr>
+        <w:keepNext/>
+        <w:pBdr>
+          <w:left w:val="double" w:sz="12" w:space="8" w:color="B45309"/>
+        </w:pBdr>
+        <w:shd w:val="clear" w:color="auto" w:fill="FCE9D6"/>
+        <w:spacing w:before="160" w:after="40"/>
+      </w:pPr>
+      <w:r>
+        <w:rPr>
+          <w:rFonts w:ascii="Cambria" w:hAnsi="Cambria"/>
+          <w:b/>
+          <w:color w:val="B45309"/>
+          <w:sz w:val="30"/>
+        </w:rPr>
+        <w:t>G10</w:t>
+      </w:r>
+      <w:r>
+        <w:rPr>
+          <w:rFonts w:ascii="Cambria" w:hAnsi="Cambria"/>
+          <w:b/>
+          <w:color w:val="2C5F2D"/>
+          <w:sz w:val="24"/>
+        </w:rPr>
         <w:t xml:space="preserve">   Bridge into the Exercise</w:t>
       </w:r>
       <w:r>
@@ -894,7 +1201,7 @@
           <w:color w:val="7F7F7F"/>
           <w:sz w:val="16"/>
         </w:rPr>
-        <w:t xml:space="preserve">   · slide 8 of 15</w:t>
+        <w:t xml:space="preserve">   · slide 10 of 17</w:t>
       </w:r>
     </w:p>
     <w:p>
@@ -911,7 +1218,7 @@
           <w:color w:val="6B8E3F"/>
           <w:sz w:val="18"/>
         </w:rPr>
-        <w:t xml:space="preserve">S9 · 7:40–7:42 · </w:t>
+        <w:t xml:space="preserve">S9 · 7:31–7:35 · </w:t>
       </w:r>
       <w:r>
         <w:rPr>
@@ -945,7 +1252,7 @@
         <w:t xml:space="preserve">BEATS: </w:t>
       </w:r>
       <w:r>
-        <w:t>1. Preview the shape: guided prayer 12–15 min, whole room, eyes open or closed, your own family beside you; then 5 min silent journaling; then pairs for sharing by invitation only — silence is a complete answer. 2. Room about ten or fewer: name it now — sharing happens right in this circle, no moving. 3. Pray the bridge prayer: where it is hard, be tender; where it is closed, be patient; where it is opening, be present.</w:t>
+        <w:t>1. Preview the shape: guided prayer 12–15 min, whole room, eyes open or closed, your own family beside you; then 5 min silent journaling; then pairs for sharing by invitation only — silence is a complete answer. 2. Room about ten or fewer: name it now — sharing happens right in this circle, no moving. 3. One line from the testing slide: notice, don't conclude — tonight is for noticing; the returns are for testing. 4. Pray the bridge prayer: where it is hard, be tender; where it is closed, be patient; where it is opening, be present.</w:t>
       </w:r>
     </w:p>
     <w:p>
@@ -964,7 +1271,7 @@
           <w:color w:val="B45309"/>
           <w:sz w:val="30"/>
         </w:rPr>
-        <w:t>G9</w:t>
+        <w:t>G11</w:t>
       </w:r>
       <w:r>
         <w:rPr>
@@ -989,7 +1296,7 @@
           <w:color w:val="7F7F7F"/>
           <w:sz w:val="16"/>
         </w:rPr>
-        <w:t xml:space="preserve">   · slide 9 of 15</w:t>
+        <w:t xml:space="preserve">   · slide 11 of 17</w:t>
       </w:r>
     </w:p>
     <w:p>
@@ -1006,7 +1313,7 @@
           <w:color w:val="6B8E3F"/>
           <w:sz w:val="18"/>
         </w:rPr>
-        <w:t xml:space="preserve">S9 · 7:42–8:14 · </w:t>
+        <w:t xml:space="preserve">S9 · 7:35–8:07 · </w:t>
       </w:r>
       <w:r>
         <w:rPr>
@@ -1112,7 +1419,7 @@
           <w:color w:val="B45309"/>
           <w:sz w:val="30"/>
         </w:rPr>
-        <w:t>G10</w:t>
+        <w:t>G12</w:t>
       </w:r>
       <w:r>
         <w:rPr>
@@ -1137,7 +1444,7 @@
           <w:color w:val="7F7F7F"/>
           <w:sz w:val="16"/>
         </w:rPr>
-        <w:t xml:space="preserve">   · slide 10 of 15</w:t>
+        <w:t xml:space="preserve">   · slide 12 of 17</w:t>
       </w:r>
     </w:p>
     <w:p>
@@ -1154,7 +1461,7 @@
           <w:color w:val="6B8E3F"/>
           <w:sz w:val="18"/>
         </w:rPr>
-        <w:t xml:space="preserve">S9 · 8:14–8:20 · </w:t>
+        <w:t xml:space="preserve">S9 · 8:07–8:13 · </w:t>
       </w:r>
       <w:r>
         <w:rPr>
@@ -1224,7 +1531,7 @@
           <w:color w:val="B45309"/>
           <w:sz w:val="30"/>
         </w:rPr>
-        <w:t>G11</w:t>
+        <w:t>G13</w:t>
       </w:r>
       <w:r>
         <w:rPr>
@@ -1249,7 +1556,7 @@
           <w:color w:val="7F7F7F"/>
           <w:sz w:val="16"/>
         </w:rPr>
-        <w:t xml:space="preserve">   · slide 11 of 15</w:t>
+        <w:t xml:space="preserve">   · slide 13 of 17</w:t>
       </w:r>
     </w:p>
     <w:p>
@@ -1266,7 +1573,7 @@
           <w:color w:val="6B8E3F"/>
           <w:sz w:val="18"/>
         </w:rPr>
-        <w:t xml:space="preserve">S9 · 8:20–8:24 · </w:t>
+        <w:t xml:space="preserve">S9 · 8:13–8:18 · </w:t>
       </w:r>
       <w:r>
         <w:rPr>
@@ -1299,7 +1606,7 @@
         <w:t xml:space="preserve">BEATS: </w:t>
       </w:r>
       <w:r>
-        <w:t>1. Co-Companion (Parent) leads. Three brief returns to the garden this week, 5–10 min each — no script needed, you have the place now; journal each visit (H9.2). 2. Gentle warning: a return can surface something heavy — you can stop, open your eyes, come back another day; and tell a trusted adult. You are not meant to carry the heavy things alone. 3. For the uneasy: H9.3, the Note for the Skeptic — adapting the practice or sitting it out is honored.</w:t>
+        <w:t>1. Co-Companion (Parent) leads. Three brief returns to the garden this week, 5–10 min each — no script needed, you have the place now; journal each visit (H9.2). 2. Gentle warning: a return can surface something heavy — you can stop, open your eyes, come back another day; and tell a trusted adult. You are not meant to carry the heavy things alone. 3. After each return, test it: two lines in the journal — does what I noticed fit Scripture? who could I tell? The How Did You Know? card (H9.4) has the checks. 4. For the uneasy: H9.3, the Note for the Skeptic — adapting the practice or sitting it out is honored.</w:t>
       </w:r>
     </w:p>
     <w:p>
@@ -1336,7 +1643,7 @@
           <w:color w:val="B45309"/>
           <w:sz w:val="30"/>
         </w:rPr>
-        <w:t>G12</w:t>
+        <w:t>G14</w:t>
       </w:r>
       <w:r>
         <w:rPr>
@@ -1361,7 +1668,7 @@
           <w:color w:val="7F7F7F"/>
           <w:sz w:val="16"/>
         </w:rPr>
-        <w:t xml:space="preserve">   · slide 12 of 15</w:t>
+        <w:t xml:space="preserve">   · slide 14 of 17</w:t>
       </w:r>
     </w:p>
     <w:p>
@@ -1478,7 +1785,7 @@
           <w:color w:val="B45309"/>
           <w:sz w:val="30"/>
         </w:rPr>
-        <w:t>G13</w:t>
+        <w:t>G15</w:t>
       </w:r>
       <w:r>
         <w:rPr>
@@ -1503,7 +1810,7 @@
           <w:color w:val="7F7F7F"/>
           <w:sz w:val="16"/>
         </w:rPr>
-        <w:t xml:space="preserve">   · slide 13 of 15</w:t>
+        <w:t xml:space="preserve">   · slide 15 of 17</w:t>
       </w:r>
     </w:p>
     <w:p>
@@ -1609,7 +1916,7 @@
           <w:color w:val="6B3FA0"/>
           <w:sz w:val="30"/>
         </w:rPr>
-        <w:t>G14</w:t>
+        <w:t>G16</w:t>
       </w:r>
       <w:r>
         <w:rPr>
@@ -1634,7 +1941,7 @@
           <w:color w:val="7F7F7F"/>
           <w:sz w:val="16"/>
         </w:rPr>
-        <w:t xml:space="preserve">   · slide 14 of 15</w:t>
+        <w:t xml:space="preserve">   · slide 16 of 17</w:t>
       </w:r>
     </w:p>
     <w:p>
@@ -1651,7 +1958,7 @@
           <w:color w:val="6B8E3F"/>
           <w:sz w:val="18"/>
         </w:rPr>
-        <w:t xml:space="preserve">S9 · 8:24–8:28 · </w:t>
+        <w:t xml:space="preserve">S9 · 8:21–8:24 · </w:t>
       </w:r>
       <w:r>
         <w:rPr>
@@ -1703,7 +2010,7 @@
           <w:color w:val="1F4E79"/>
           <w:sz w:val="30"/>
         </w:rPr>
-        <w:t>G15</w:t>
+        <w:t>G17</w:t>
       </w:r>
       <w:r>
         <w:rPr>
@@ -1728,7 +2035,7 @@
           <w:color w:val="7F7F7F"/>
           <w:sz w:val="16"/>
         </w:rPr>
-        <w:t xml:space="preserve">   · slide 15 of 15</w:t>
+        <w:t xml:space="preserve">   · slide 17 of 17</w:t>
       </w:r>
     </w:p>
     <w:p>
@@ -1745,7 +2052,7 @@
           <w:color w:val="6B8E3F"/>
           <w:sz w:val="18"/>
         </w:rPr>
-        <w:t xml:space="preserve">S9 · 8:28–8:30 · </w:t>
+        <w:t xml:space="preserve">S9 · 8:24–8:30 · </w:t>
       </w:r>
       <w:r>
         <w:rPr>

</xml_diff>

<commit_message>
v2.31 (John's word, 13 October): Sessions 9-10 - the garden in two rounds
Round one: picture your heart as a garden, write, share (Jesus not yet
invited). Round two: go back, invite Jesus in and give him permission to do
or say anything he wishes, return, write, share. The garden slide becomes
Round One and Round Two (deck G1-G18), bridge and road name the rounds,
leader notes rebuilt; new Reading Card (H9.1 split at the gate, one round
per page) synced to Leader Notes; run sheet garden row split, still two pages.

Co-Authored-By: Claude Opus 5.5 <noreply@anthropic.com>
</commit_message>
<xml_diff>
--- a/_implementation-notes/evening-series/FotH Evening Session 9-10 Combined Leader Notes DRAFT v1.docx
+++ b/_implementation-notes/evening-series/FotH Evening Session 9-10 Combined Leader Notes DRAFT v1.docx
@@ -45,7 +45,7 @@
           <w:color w:val="595959"/>
           <w:sz w:val="18"/>
         </w:rPr>
-        <w:t>Match the big number on each block to the number in the bottom-right corner of the screen. This is a combined evening, so its slides are numbered with a letter: G2–G17. The letter keeps this deck outside the series' one continuous numbering; the separate two-evening versions of these sessions, held in reserve, keep the plain series numbers. The first slide, the series title, is “Title” here.</w:t>
+        <w:t>Match the big number on each block to the number in the bottom-right corner of the screen. This is a combined evening, so its slides are numbered with a letter: G2–G18. The letter keeps this deck outside the series' one continuous numbering; the separate two-evening versions of these sessions, held in reserve, keep the plain series numbers. The first slide, the series title, is “Title” here.</w:t>
       </w:r>
     </w:p>
     <w:p>
@@ -147,7 +147,7 @@
           <w:color w:val="7F7F7F"/>
           <w:sz w:val="16"/>
         </w:rPr>
-        <w:t xml:space="preserve">   · slide 1 of 17</w:t>
+        <w:t xml:space="preserve">   · slide 1 of 18</w:t>
       </w:r>
     </w:p>
     <w:p>
@@ -219,7 +219,7 @@
           <w:color w:val="7F7F7F"/>
           <w:sz w:val="16"/>
         </w:rPr>
-        <w:t xml:space="preserve">   · slide 2 of 17</w:t>
+        <w:t xml:space="preserve">   · slide 2 of 18</w:t>
       </w:r>
     </w:p>
     <w:p>
@@ -291,7 +291,7 @@
           <w:color w:val="7F7F7F"/>
           <w:sz w:val="16"/>
         </w:rPr>
-        <w:t xml:space="preserve">   · slide 3 of 17</w:t>
+        <w:t xml:space="preserve">   · slide 3 of 18</w:t>
       </w:r>
     </w:p>
     <w:p>
@@ -434,7 +434,7 @@
           <w:color w:val="7F7F7F"/>
           <w:sz w:val="16"/>
         </w:rPr>
-        <w:t xml:space="preserve">   · slide 4 of 17</w:t>
+        <w:t xml:space="preserve">   · slide 4 of 18</w:t>
       </w:r>
     </w:p>
     <w:p>
@@ -503,7 +503,7 @@
         <w:spacing w:before="0" w:after="60"/>
       </w:pPr>
       <w:r>
-        <w:t>2. Shape: open, a short check-in, remembering a real hearing and how we knew (the tests, before the garden), Scripture and framing (John 15; Psalm 23), bridge and settle, the guided run — a senior reads the walk-through, two words per second, the pauses are where the work happens; adults hold the sharing — journaling, pair sharing by invitation, merge, the returns commissioned, feedback, gentle close.</w:t>
+        <w:t>2. Shape: open, a short check-in, remembering a real hearing and how we knew (the tests, before the garden), Scripture and framing (John 15; Psalm 23), bridge and settle, the garden in two rounds — round one the garden, round two Jesus invited in with permission to do or say anything he wishes; a senior reads, two words per second, the pauses are where the work happens; write and share in pairs after each round, the adults holding the sharing; merge, the returns commissioned, feedback, gentle close.</w:t>
       </w:r>
     </w:p>
     <w:p>
@@ -587,7 +587,7 @@
           <w:color w:val="7F7F7F"/>
           <w:sz w:val="16"/>
         </w:rPr>
-        <w:t xml:space="preserve">   · slide 5 of 17</w:t>
+        <w:t xml:space="preserve">   · slide 5 of 18</w:t>
       </w:r>
     </w:p>
     <w:p>
@@ -699,7 +699,7 @@
           <w:color w:val="7F7F7F"/>
           <w:sz w:val="16"/>
         </w:rPr>
-        <w:t xml:space="preserve">   · slide 6 of 17</w:t>
+        <w:t xml:space="preserve">   · slide 6 of 18</w:t>
       </w:r>
     </w:p>
     <w:p>
@@ -811,7 +811,7 @@
           <w:color w:val="7F7F7F"/>
           <w:sz w:val="16"/>
         </w:rPr>
-        <w:t xml:space="preserve">   · slide 7 of 17</w:t>
+        <w:t xml:space="preserve">   · slide 7 of 18</w:t>
       </w:r>
     </w:p>
     <w:p>
@@ -959,7 +959,7 @@
           <w:color w:val="7F7F7F"/>
           <w:sz w:val="16"/>
         </w:rPr>
-        <w:t xml:space="preserve">   · slide 8 of 17</w:t>
+        <w:t xml:space="preserve">   · slide 8 of 18</w:t>
       </w:r>
     </w:p>
     <w:p>
@@ -1107,7 +1107,7 @@
           <w:color w:val="7F7F7F"/>
           <w:sz w:val="16"/>
         </w:rPr>
-        <w:t xml:space="preserve">   · slide 9 of 17</w:t>
+        <w:t xml:space="preserve">   · slide 9 of 18</w:t>
       </w:r>
     </w:p>
     <w:p>
@@ -1201,7 +1201,7 @@
           <w:color w:val="7F7F7F"/>
           <w:sz w:val="16"/>
         </w:rPr>
-        <w:t xml:space="preserve">   · slide 10 of 17</w:t>
+        <w:t xml:space="preserve">   · slide 10 of 18</w:t>
       </w:r>
     </w:p>
     <w:p>
@@ -1252,7 +1252,7 @@
         <w:t xml:space="preserve">BEATS: </w:t>
       </w:r>
       <w:r>
-        <w:t>1. Preview the shape: guided prayer 12–15 min, whole room, eyes open or closed, your own family beside you; then 5 min silent journaling; then pairs for sharing by invitation only — silence is a complete answer. 2. Room about ten or fewer: name it now — sharing happens right in this circle, no moving. 3. One line from the testing slide: notice, don't conclude — tonight is for noticing; the returns are for testing. 4. Pray the bridge prayer: where it is hard, be tender; where it is closed, be patient; where it is opening, be present.</w:t>
+        <w:t>1. Preview the shape: two rounds. Round one, the garden — read, write, share. Round two, go back and invite Jesus in, giving him permission to do or say anything he wishes — read, write, share. Whole room, eyes open or closed, your own family beside you; sharing by invitation only — silence is a complete answer. 2. Room about ten or fewer: name it now — sharing happens right in this circle, no moving. 3. One line from the testing slide: notice, don't conclude — tonight is for noticing; the returns are for testing. 4. Pray the bridge prayer: where it is hard, be tender; where it is closed, be patient; where it is opening, be present.</w:t>
       </w:r>
     </w:p>
     <w:p>
@@ -1280,7 +1280,7 @@
           <w:color w:val="2C5F2D"/>
           <w:sz w:val="24"/>
         </w:rPr>
-        <w:t xml:space="preserve">   The Garden Exercise — Whole Room, then pairs</w:t>
+        <w:t xml:space="preserve">   The Garden — Round One: Your Heart as a Garden</w:t>
       </w:r>
       <w:r>
         <w:rPr>
@@ -1296,7 +1296,7 @@
           <w:color w:val="7F7F7F"/>
           <w:sz w:val="16"/>
         </w:rPr>
-        <w:t xml:space="preserve">   · slide 11 of 17</w:t>
+        <w:t xml:space="preserve">   · slide 11 of 18</w:t>
       </w:r>
     </w:p>
     <w:p>
@@ -1313,7 +1313,7 @@
           <w:color w:val="6B8E3F"/>
           <w:sz w:val="18"/>
         </w:rPr>
-        <w:t xml:space="preserve">S9 · 7:35–8:07 · </w:t>
+        <w:t xml:space="preserve">S9 · 7:35–7:48 · </w:t>
       </w:r>
       <w:r>
         <w:rPr>
@@ -1346,7 +1346,155 @@
         <w:t xml:space="preserve">BEATS: </w:t>
       </w:r>
       <w:r>
-        <w:t>1. Settle 2 min. Guided prayer 12–15 min: read H9.1 slowly — two words per second, not three; every (pause) is a full 30 seconds, every (longer pause) 60. The pauses are where the work happens. 2. Silent journaling 5 min. 3. Then pairs for sharing by invitation, 8–10 min: the Companion models two plain sentences first, the arranged parent opens — receive without interpreting; never 'God was telling you...'.</w:t>
+        <w:t>1. Settle, 1 minute. 2. ROUND ONE — the reader reads Round One of the Garden Reading Card: picture your heart as a garden, walk in, notice. Two words per second, not three; every (pause) is a full 30 seconds, every (longer pause) 60 — the pauses are where the work happens. About 5 minutes. Jesus is not invited yet; this round is only the garden. 3. Write, 3 minutes: 'What does your garden look like? What is growing; what feels alive, what feels closed?' 4. Share in pairs, 4 minutes, by invitation: the arranged parent opens — receive without interpreting.</w:t>
+      </w:r>
+    </w:p>
+    <w:p>
+      <w:pPr>
+        <w:pBdr>
+          <w:left w:val="double" w:sz="12" w:space="8" w:color="B45309"/>
+        </w:pBdr>
+        <w:spacing w:before="0" w:after="60"/>
+      </w:pPr>
+      <w:r>
+        <w:rPr>
+          <w:b/>
+          <w:color w:val="595959"/>
+        </w:rPr>
+        <w:t xml:space="preserve">CUES: </w:t>
+      </w:r>
+      <w:r>
+        <w:t>Never cold-call a teen; pass-anytime holds. Keep the clock: round two needs its full time.</w:t>
+      </w:r>
+    </w:p>
+    <w:p>
+      <w:pPr>
+        <w:pBdr>
+          <w:left w:val="double" w:sz="12" w:space="8" w:color="B45309"/>
+        </w:pBdr>
+        <w:spacing w:before="0" w:after="60"/>
+      </w:pPr>
+      <w:r>
+        <w:rPr>
+          <w:b/>
+          <w:color w:val="595959"/>
+        </w:rPr>
+        <w:t xml:space="preserve">GUARD: </w:t>
+      </w:r>
+      <w:r>
+        <w:t>If overwhelm goes past quiet reassurance, run the Settle Protocol — stop for THEM, not for the circle: plain directive words, back to the room, breathe and anchor, no return to the exercise today; nobody leaves activated.</w:t>
+      </w:r>
+    </w:p>
+    <w:p>
+      <w:pPr>
+        <w:pBdr>
+          <w:left w:val="double" w:sz="12" w:space="8" w:color="B45309"/>
+        </w:pBdr>
+        <w:spacing w:before="0" w:after="60"/>
+      </w:pPr>
+      <w:r>
+        <w:rPr>
+          <w:b/>
+          <w:color w:val="595959"/>
+        </w:rPr>
+        <w:t xml:space="preserve">COMBINED FORM: </w:t>
+      </w:r>
+      <w:r>
+        <w:t>a Companion-in-Formation reads from the Garden Reading Card (pacing as H10.1: two words per second, (pause) = 30 seconds, (longer pause) = 60); the adults hold the sharing and anything that surfaces. The bright line governs throughout.</w:t>
+      </w:r>
+    </w:p>
+    <w:p>
+      <w:pPr>
+        <w:keepNext/>
+        <w:pBdr>
+          <w:left w:val="double" w:sz="12" w:space="8" w:color="B45309"/>
+        </w:pBdr>
+        <w:shd w:val="clear" w:color="auto" w:fill="FCE9D6"/>
+        <w:spacing w:before="160" w:after="40"/>
+      </w:pPr>
+      <w:r>
+        <w:rPr>
+          <w:rFonts w:ascii="Cambria" w:hAnsi="Cambria"/>
+          <w:b/>
+          <w:color w:val="B45309"/>
+          <w:sz w:val="30"/>
+        </w:rPr>
+        <w:t>G12</w:t>
+      </w:r>
+      <w:r>
+        <w:rPr>
+          <w:rFonts w:ascii="Cambria" w:hAnsi="Cambria"/>
+          <w:b/>
+          <w:color w:val="2C5F2D"/>
+          <w:sz w:val="24"/>
+        </w:rPr>
+        <w:t xml:space="preserve">   The Garden — Round Two: Invite Jesus In</w:t>
+      </w:r>
+      <w:r>
+        <w:rPr>
+          <w:b/>
+          <w:color w:val="B45309"/>
+          <w:sz w:val="17"/>
+        </w:rPr>
+        <w:t xml:space="preserve">    CONTENT PRESENTER</w:t>
+      </w:r>
+      <w:r>
+        <w:rPr>
+          <w:b w:val="0"/>
+          <w:color w:val="7F7F7F"/>
+          <w:sz w:val="16"/>
+        </w:rPr>
+        <w:t xml:space="preserve">   · slide 12 of 18</w:t>
+      </w:r>
+    </w:p>
+    <w:p>
+      <w:pPr>
+        <w:keepNext/>
+        <w:pBdr>
+          <w:left w:val="double" w:sz="12" w:space="8" w:color="B45309"/>
+        </w:pBdr>
+        <w:spacing w:before="0" w:after="60"/>
+      </w:pPr>
+      <w:r>
+        <w:rPr>
+          <w:b/>
+          <w:color w:val="6B8E3F"/>
+          <w:sz w:val="18"/>
+        </w:rPr>
+        <w:t xml:space="preserve">S9 · 7:48–8:07 · </w:t>
+      </w:r>
+      <w:r>
+        <w:rPr>
+          <w:b/>
+          <w:color w:val="B45309"/>
+          <w:sz w:val="18"/>
+        </w:rPr>
+        <w:t>LEAD: CONTENT PRESENTER</w:t>
+      </w:r>
+      <w:r>
+        <w:rPr>
+          <w:b/>
+          <w:color w:val="6B8E3F"/>
+          <w:sz w:val="18"/>
+        </w:rPr>
+      </w:r>
+    </w:p>
+    <w:p>
+      <w:pPr>
+        <w:pBdr>
+          <w:left w:val="double" w:sz="12" w:space="8" w:color="B45309"/>
+        </w:pBdr>
+        <w:spacing w:before="0" w:after="60"/>
+      </w:pPr>
+      <w:r>
+        <w:rPr>
+          <w:b/>
+          <w:color w:val="595959"/>
+        </w:rPr>
+        <w:t xml:space="preserve">BEATS: </w:t>
+      </w:r>
+      <w:r>
+        <w:t>1. ROUND TWO — the reader reads Round Two of the Garden Reading Card: go back to the garden; Jesus is at the entrance; invite him in and give him permission to do or say anything he wishes; watch where he goes and what he does; listen for a word; then return — thank him, tell him you will be back, open your eyes. About 8 minutes with the pauses. 2. Write, 4 minutes: what did he do, where did he go, did he say anything? 'Nothing happened' is honest. 3. Share in pairs, 6 minutes, by invitation: the Companion models two plain sentences first, the arranged parent opens — receive without interpreting; never 'God was telling you...'. Notice, don't conclude: the returns are for testing.</w:t>
       </w:r>
     </w:p>
     <w:p>
@@ -1397,10 +1545,10 @@
           <w:b/>
           <w:color w:val="595959"/>
         </w:rPr>
-        <w:t xml:space="preserve">COMBINED FORM: </w:t>
+        <w:t xml:space="preserve">FROM: </w:t>
       </w:r>
       <w:r>
-        <w:t>a Companion-in-Formation reads the walk-through from H10.1's pacing — two words per second, (pause) = 30 full seconds, (longer pause) = 60; the adults hold the sharing and anything that surfaces. The bright line governs throughout.</w:t>
+        <w:t>the Four Connects deck (FotH, September 2025), 'Hearing God — The How': invite in Jesus, give him permission to do his thing; share with the group.</w:t>
       </w:r>
     </w:p>
     <w:p>
@@ -1419,7 +1567,7 @@
           <w:color w:val="B45309"/>
           <w:sz w:val="30"/>
         </w:rPr>
-        <w:t>G12</w:t>
+        <w:t>G13</w:t>
       </w:r>
       <w:r>
         <w:rPr>
@@ -1444,7 +1592,7 @@
           <w:color w:val="7F7F7F"/>
           <w:sz w:val="16"/>
         </w:rPr>
-        <w:t xml:space="preserve">   · slide 12 of 17</w:t>
+        <w:t xml:space="preserve">   · slide 13 of 18</w:t>
       </w:r>
     </w:p>
     <w:p>
@@ -1531,7 +1679,7 @@
           <w:color w:val="B45309"/>
           <w:sz w:val="30"/>
         </w:rPr>
-        <w:t>G13</w:t>
+        <w:t>G14</w:t>
       </w:r>
       <w:r>
         <w:rPr>
@@ -1556,7 +1704,7 @@
           <w:color w:val="7F7F7F"/>
           <w:sz w:val="16"/>
         </w:rPr>
-        <w:t xml:space="preserve">   · slide 13 of 17</w:t>
+        <w:t xml:space="preserve">   · slide 14 of 18</w:t>
       </w:r>
     </w:p>
     <w:p>
@@ -1643,7 +1791,7 @@
           <w:color w:val="B45309"/>
           <w:sz w:val="30"/>
         </w:rPr>
-        <w:t>G14</w:t>
+        <w:t>G15</w:t>
       </w:r>
       <w:r>
         <w:rPr>
@@ -1668,7 +1816,7 @@
           <w:color w:val="7F7F7F"/>
           <w:sz w:val="16"/>
         </w:rPr>
-        <w:t xml:space="preserve">   · slide 14 of 17</w:t>
+        <w:t xml:space="preserve">   · slide 15 of 18</w:t>
       </w:r>
     </w:p>
     <w:p>
@@ -1785,7 +1933,7 @@
           <w:color w:val="B45309"/>
           <w:sz w:val="30"/>
         </w:rPr>
-        <w:t>G15</w:t>
+        <w:t>G16</w:t>
       </w:r>
       <w:r>
         <w:rPr>
@@ -1810,7 +1958,7 @@
           <w:color w:val="7F7F7F"/>
           <w:sz w:val="16"/>
         </w:rPr>
-        <w:t xml:space="preserve">   · slide 15 of 17</w:t>
+        <w:t xml:space="preserve">   · slide 16 of 18</w:t>
       </w:r>
     </w:p>
     <w:p>
@@ -1916,7 +2064,7 @@
           <w:color w:val="6B3FA0"/>
           <w:sz w:val="30"/>
         </w:rPr>
-        <w:t>G16</w:t>
+        <w:t>G17</w:t>
       </w:r>
       <w:r>
         <w:rPr>
@@ -1941,7 +2089,7 @@
           <w:color w:val="7F7F7F"/>
           <w:sz w:val="16"/>
         </w:rPr>
-        <w:t xml:space="preserve">   · slide 16 of 17</w:t>
+        <w:t xml:space="preserve">   · slide 17 of 18</w:t>
       </w:r>
     </w:p>
     <w:p>
@@ -2010,7 +2158,7 @@
           <w:color w:val="1F4E79"/>
           <w:sz w:val="30"/>
         </w:rPr>
-        <w:t>G17</w:t>
+        <w:t>G18</w:t>
       </w:r>
       <w:r>
         <w:rPr>
@@ -2035,7 +2183,7 @@
           <w:color w:val="7F7F7F"/>
           <w:sz w:val="16"/>
         </w:rPr>
-        <w:t xml:space="preserve">   · slide 17 of 17</w:t>
+        <w:t xml:space="preserve">   · slide 18 of 18</w:t>
       </w:r>
     </w:p>
     <w:p>

</xml_diff>

<commit_message>
v2.32 (John's word, 13 October): Sessions 9-10 garden checked against the Four Connects process
Relaxation before each round (breath, toes up, present to the great I AM;
back to the relaxed place for round two); write what you saw, heard,
smelled or felt; round two open as in the Four Connects (invite, permission
to do or say anything he wishes, about five minutes of silence); the merge
asks what changed with Jesus in the garden, each reading their own images;
the close asks "What will you do or say differently?". Slides, leader notes,
Reading Card and run sheet updated; garden keeps 7:35-8:07.

Co-Authored-By: Claude Opus 5.5 <noreply@anthropic.com>
</commit_message>
<xml_diff>
--- a/_implementation-notes/evening-series/FotH Evening Session 9-10 Combined Leader Notes DRAFT v1.docx
+++ b/_implementation-notes/evening-series/FotH Evening Session 9-10 Combined Leader Notes DRAFT v1.docx
@@ -1346,7 +1346,7 @@
         <w:t xml:space="preserve">BEATS: </w:t>
       </w:r>
       <w:r>
-        <w:t>1. Settle, 1 minute. 2. ROUND ONE — the reader reads Round One of the Garden Reading Card: picture your heart as a garden, walk in, notice. Two words per second, not three; every (pause) is a full 30 seconds, every (longer pause) 60 — the pauses are where the work happens. About 5 minutes. Jesus is not invited yet; this round is only the garden. 3. Write, 3 minutes: 'What does your garden look like? What is growing; what feels alive, what feels closed?' 4. Share in pairs, 4 minutes, by invitation: the arranged parent opens — receive without interpreting.</w:t>
+        <w:t>1. Pens and journals ready beforehand, then set aside. 2. RELAX, 2 minutes — the reader reads the Settle section of the Reading Card: breath focus, in and out, then relaxing from the toes up, stage by stage; relaxed and present, and so present to the great I AM. 3. ROUND ONE, about 4 minutes: picture your heart as a garden; let it sit a minute; make it clearer — the light, the temperature, the time of day; another minute; then come back to here. Two words per second; the pauses are where the work happens. Jesus is not invited yet. 4. Write, 3 minutes: what did you see, hear, smell, or feel there? 5. Share in pairs, 4 minutes, by invitation: the arranged parent opens — receive without interpreting.</w:t>
       </w:r>
     </w:p>
     <w:p>
@@ -1397,10 +1397,10 @@
           <w:b/>
           <w:color w:val="595959"/>
         </w:rPr>
-        <w:t xml:space="preserve">COMBINED FORM: </w:t>
+        <w:t xml:space="preserve">FROM: </w:t>
       </w:r>
       <w:r>
-        <w:t>a Companion-in-Formation reads from the Garden Reading Card (pacing as H10.1: two words per second, (pause) = 30 seconds, (longer pause) = 60); the adults hold the sharing and anything that surfaces. The bright line governs throughout.</w:t>
+        <w:t>the Four Connects deck (FotH, September 2025), 'Garden of the Heart': prepare to write, relaxation to get present to the great I AM, the garden, record, share.</w:t>
       </w:r>
     </w:p>
     <w:p>
@@ -1494,7 +1494,7 @@
         <w:t xml:space="preserve">BEATS: </w:t>
       </w:r>
       <w:r>
-        <w:t>1. ROUND TWO — the reader reads Round Two of the Garden Reading Card: go back to the garden; Jesus is at the entrance; invite him in and give him permission to do or say anything he wishes; watch where he goes and what he does; listen for a word; then return — thank him, tell him you will be back, open your eyes. About 8 minutes with the pauses. 2. Write, 4 minutes: what did he do, where did he go, did he say anything? 'Nothing happened' is honest. 3. Share in pairs, 6 minutes, by invitation: the Companion models two plain sentences first, the arranged parent opens — receive without interpreting; never 'God was telling you...'. Notice, don't conclude: the returns are for testing.</w:t>
+        <w:t>1. Take them back to the relaxed state, 1 minute: breathe, relax, picture the garden again. 2. ROUND TWO: invite Jesus in; give him permission to do or say anything he wishes; ask him to do or say whatever he wants. Then the reader stops talking and holds the silence for about five minutes. Do not fill it; watch the clock, not the faces' patience. Then: 'When you are ready, come back to here, and open your eyes.' 3. Write, 4 minutes: what did you see, hear, smell, or feel? What did he do or say? 'Nothing happened' is honest. Everyone writes before anyone shares. 4. Share in pairs, 6 minutes, by invitation: the Companion models two plain sentences first, the arranged parent opens — receive without interpreting; never 'God was telling you...'. Notice, don't conclude: the returns are for testing.</w:t>
       </w:r>
     </w:p>
     <w:p>
@@ -1548,7 +1548,7 @@
         <w:t xml:space="preserve">FROM: </w:t>
       </w:r>
       <w:r>
-        <w:t>the Four Connects deck (FotH, September 2025), 'Hearing God — The How': invite in Jesus, give him permission to do his thing; share with the group.</w:t>
+        <w:t>the Four Connects deck (FotH, September 2025), 'Garden of the Heart': take them back to that relaxed state; picture the heart again; invite Jesus in; suggest they ask him to do or say whatever he wants; let it sit a few minutes; return and record; then share.</w:t>
       </w:r>
     </w:p>
     <w:p>
@@ -1576,7 +1576,7 @@
           <w:color w:val="2C5F2D"/>
           <w:sz w:val="24"/>
         </w:rPr>
-        <w:t xml:space="preserve">   Merge and One-Word Landing</w:t>
+        <w:t xml:space="preserve">   Merge — the Garden, and the Garden with Jesus in It</w:t>
       </w:r>
       <w:r>
         <w:rPr>
@@ -1642,7 +1642,7 @@
         <w:t xml:space="preserve">BEATS: </w:t>
       </w:r>
       <w:r>
-        <w:t>1. The room will be quieter than usual — honor it; wait before speaking. 2. What happened in the pairs stays there; ask only one word about today — 'surprised', 'tender', 'empty', 'found', 'quiet'. 3. Receive each word with eye contact and a slight nod; say nothing else. 4. Close: whatever happened today is yours; some of it will quietly do its work for a long time.</w:t>
+        <w:t>1. The room will be quieter than usual — honor it; wait before speaking. What happened in the pairs stays there. 2. The comparison, about 4 minutes, whole room, by invitation: 'Were there any differences between the garden and the garden with Jesus in it? What did they look like? What might your images tell you about yourself? About Jesus with you and in you?' Take one or two; time decides. 3. Each person reads their own images; no one interprets anyone else's. Receive with 'Thank you.' 4. Then one word about tonight, about 2 minutes — 'surprised', 'tender', 'empty', 'found', 'quiet' — received with a nod, nothing else. Close: whatever happened tonight is yours; some of it will keep happening across the week.</w:t>
       </w:r>
     </w:p>
     <w:p>
@@ -1661,6 +1661,24 @@
       </w:r>
       <w:r>
         <w:t>Arranged parent begins; anyone may pass.</w:t>
+      </w:r>
+    </w:p>
+    <w:p>
+      <w:pPr>
+        <w:pBdr>
+          <w:left w:val="double" w:sz="12" w:space="8" w:color="B45309"/>
+        </w:pBdr>
+        <w:spacing w:before="0" w:after="60"/>
+      </w:pPr>
+      <w:r>
+        <w:rPr>
+          <w:b/>
+          <w:color w:val="595959"/>
+        </w:rPr>
+        <w:t xml:space="preserve">FROM: </w:t>
+      </w:r>
+      <w:r>
+        <w:t>the Four Connects deck (FotH, September 2025), 'Garden of the Heart': after the small groups, ask if anyone wants to share — the differences, and what the images tell you.</w:t>
       </w:r>
     </w:p>
     <w:p>
@@ -2233,7 +2251,7 @@
         <w:t xml:space="preserve">BEATS: </w:t>
       </w:r>
       <w:r>
-        <w:t>1. 'What happened in your pair is yours. Carry it gently — don't debrief it on the way home unless your heart is fully ready.' 2. If something heavy surfaced, reach out — the team is walking with you. 3. Aaronic blessing; see you evenings.</w:t>
+        <w:t>0. Step 4 tonight asks the Four Connects impact question: 'What will you do or say differently?' — one sentence, committed aloud. 1. 'What happened in your pair is yours. Carry it gently — don't debrief it on the way home unless your heart is fully ready.' 2. If something heavy surfaced, reach out — the team is walking with you. 3. Aaronic blessing; see you evenings.</w:t>
       </w:r>
     </w:p>
     <w:p>

</xml_diff>

<commit_message>
v2.48: Evening 7's materials carry the long gap (John's word, 2026-10-28) - four-week take-home on one page (weeks 1-4 grid; garden returns, check-in, week two, weeks three and four chosen with why; two preparation sentences); new Practices So Far card (Evenings 1-7); deck G15 The Long Gap, homework slide = weeks one and two, sheet slides re-imaged, close says December 8 (19 slides, leader notes rebuilt); run sheet homework 8:13-8:16, long gap and sheets 8:16-8:21, still two pages; Evening 7 page brought in line with the 13 October design (how did you know, two rounds); sync map adds the card; synced to OneDrive
Co-Authored-By: Claude Opus 5.5 <noreply@anthropic.com>
</commit_message>
<xml_diff>
--- a/_implementation-notes/evening-series/FotH Evening Session 9-10 Combined Leader Notes DRAFT v1.docx
+++ b/_implementation-notes/evening-series/FotH Evening Session 9-10 Combined Leader Notes DRAFT v1.docx
@@ -45,7 +45,7 @@
           <w:color w:val="595959"/>
           <w:sz w:val="18"/>
         </w:rPr>
-        <w:t>Match the big number on each block to the number in the bottom-right corner of the screen. This is a combined evening, so its slides are numbered with a letter: G2–G18. The letter keeps this deck outside the series' one continuous numbering; the separate two-evening versions of these sessions, held in reserve, keep the plain series numbers. The first slide, the series title, is “Title” here.</w:t>
+        <w:t>Match the big number on each block to the number in the bottom-right corner of the screen. This is a combined evening, so its slides are numbered with a letter: G2–G19. The letter keeps this deck outside the series' one continuous numbering; the separate two-evening versions of these sessions, held in reserve, keep the plain series numbers. The first slide, the series title, is “Title” here.</w:t>
       </w:r>
     </w:p>
     <w:p>
@@ -147,7 +147,7 @@
           <w:color w:val="7F7F7F"/>
           <w:sz w:val="16"/>
         </w:rPr>
-        <w:t xml:space="preserve">   · slide 1 of 18</w:t>
+        <w:t xml:space="preserve">   · slide 1 of 19</w:t>
       </w:r>
     </w:p>
     <w:p>
@@ -219,7 +219,7 @@
           <w:color w:val="7F7F7F"/>
           <w:sz w:val="16"/>
         </w:rPr>
-        <w:t xml:space="preserve">   · slide 2 of 18</w:t>
+        <w:t xml:space="preserve">   · slide 2 of 19</w:t>
       </w:r>
     </w:p>
     <w:p>
@@ -291,7 +291,7 @@
           <w:color w:val="7F7F7F"/>
           <w:sz w:val="16"/>
         </w:rPr>
-        <w:t xml:space="preserve">   · slide 3 of 18</w:t>
+        <w:t xml:space="preserve">   · slide 3 of 19</w:t>
       </w:r>
     </w:p>
     <w:p>
@@ -434,7 +434,7 @@
           <w:color w:val="7F7F7F"/>
           <w:sz w:val="16"/>
         </w:rPr>
-        <w:t xml:space="preserve">   · slide 4 of 18</w:t>
+        <w:t xml:space="preserve">   · slide 4 of 19</w:t>
       </w:r>
     </w:p>
     <w:p>
@@ -587,7 +587,7 @@
           <w:color w:val="7F7F7F"/>
           <w:sz w:val="16"/>
         </w:rPr>
-        <w:t xml:space="preserve">   · slide 5 of 18</w:t>
+        <w:t xml:space="preserve">   · slide 5 of 19</w:t>
       </w:r>
     </w:p>
     <w:p>
@@ -699,7 +699,7 @@
           <w:color w:val="7F7F7F"/>
           <w:sz w:val="16"/>
         </w:rPr>
-        <w:t xml:space="preserve">   · slide 6 of 18</w:t>
+        <w:t xml:space="preserve">   · slide 6 of 19</w:t>
       </w:r>
     </w:p>
     <w:p>
@@ -811,7 +811,7 @@
           <w:color w:val="7F7F7F"/>
           <w:sz w:val="16"/>
         </w:rPr>
-        <w:t xml:space="preserve">   · slide 7 of 18</w:t>
+        <w:t xml:space="preserve">   · slide 7 of 19</w:t>
       </w:r>
     </w:p>
     <w:p>
@@ -959,7 +959,7 @@
           <w:color w:val="7F7F7F"/>
           <w:sz w:val="16"/>
         </w:rPr>
-        <w:t xml:space="preserve">   · slide 8 of 18</w:t>
+        <w:t xml:space="preserve">   · slide 8 of 19</w:t>
       </w:r>
     </w:p>
     <w:p>
@@ -1107,7 +1107,7 @@
           <w:color w:val="7F7F7F"/>
           <w:sz w:val="16"/>
         </w:rPr>
-        <w:t xml:space="preserve">   · slide 9 of 18</w:t>
+        <w:t xml:space="preserve">   · slide 9 of 19</w:t>
       </w:r>
     </w:p>
     <w:p>
@@ -1201,7 +1201,7 @@
           <w:color w:val="7F7F7F"/>
           <w:sz w:val="16"/>
         </w:rPr>
-        <w:t xml:space="preserve">   · slide 10 of 18</w:t>
+        <w:t xml:space="preserve">   · slide 10 of 19</w:t>
       </w:r>
     </w:p>
     <w:p>
@@ -1296,7 +1296,7 @@
           <w:color w:val="7F7F7F"/>
           <w:sz w:val="16"/>
         </w:rPr>
-        <w:t xml:space="preserve">   · slide 11 of 18</w:t>
+        <w:t xml:space="preserve">   · slide 11 of 19</w:t>
       </w:r>
     </w:p>
     <w:p>
@@ -1444,7 +1444,7 @@
           <w:color w:val="7F7F7F"/>
           <w:sz w:val="16"/>
         </w:rPr>
-        <w:t xml:space="preserve">   · slide 12 of 18</w:t>
+        <w:t xml:space="preserve">   · slide 12 of 19</w:t>
       </w:r>
     </w:p>
     <w:p>
@@ -1592,7 +1592,7 @@
           <w:color w:val="7F7F7F"/>
           <w:sz w:val="16"/>
         </w:rPr>
-        <w:t xml:space="preserve">   · slide 13 of 18</w:t>
+        <w:t xml:space="preserve">   · slide 13 of 19</w:t>
       </w:r>
     </w:p>
     <w:p>
@@ -1706,7 +1706,7 @@
           <w:color w:val="2C5F2D"/>
           <w:sz w:val="24"/>
         </w:rPr>
-        <w:t xml:space="preserve">   Homework — Two Weeks, Four Parts</w:t>
+        <w:t xml:space="preserve">   Homework — Weeks One and Two</w:t>
       </w:r>
       <w:r>
         <w:rPr>
@@ -1722,7 +1722,7 @@
           <w:color w:val="7F7F7F"/>
           <w:sz w:val="16"/>
         </w:rPr>
-        <w:t xml:space="preserve">   · slide 14 of 18</w:t>
+        <w:t xml:space="preserve">   · slide 14 of 19</w:t>
       </w:r>
     </w:p>
     <w:p>
@@ -1739,7 +1739,7 @@
           <w:color w:val="6B8E3F"/>
           <w:sz w:val="18"/>
         </w:rPr>
-        <w:t xml:space="preserve">E7 · 8:13–8:18 · </w:t>
+        <w:t xml:space="preserve">E7 · 8:13–8:16 · </w:t>
       </w:r>
       <w:r>
         <w:rPr>
@@ -1795,6 +1795,24 @@
     </w:p>
     <w:p>
       <w:pPr>
+        <w:pBdr>
+          <w:left w:val="double" w:sz="12" w:space="8" w:color="B45309"/>
+        </w:pBdr>
+        <w:spacing w:before="0" w:after="60"/>
+      </w:pPr>
+      <w:r>
+        <w:rPr>
+          <w:b/>
+          <w:color w:val="595959"/>
+        </w:rPr>
+        <w:t xml:space="preserve">THE LONG GAP: </w:t>
+      </w:r>
+      <w:r>
+        <w:t>this is weeks one and two of four; the next slide gives weeks three and four.</w:t>
+      </w:r>
+    </w:p>
+    <w:p>
+      <w:pPr>
         <w:keepNext/>
         <w:pBdr>
           <w:left w:val="double" w:sz="12" w:space="8" w:color="B45309"/>
@@ -1810,6 +1828,136 @@
           <w:sz w:val="30"/>
         </w:rPr>
         <w:t>G15</w:t>
+      </w:r>
+      <w:r>
+        <w:rPr>
+          <w:rFonts w:ascii="Cambria" w:hAnsi="Cambria"/>
+          <w:b/>
+          <w:color w:val="2C5F2D"/>
+          <w:sz w:val="24"/>
+        </w:rPr>
+        <w:t xml:space="preserve">   The Long Gap — Weeks Three and Four</w:t>
+      </w:r>
+      <w:r>
+        <w:rPr>
+          <w:b/>
+          <w:color w:val="B45309"/>
+          <w:sz w:val="17"/>
+        </w:rPr>
+        <w:t xml:space="preserve">    CONTENT PRESENTER</w:t>
+      </w:r>
+      <w:r>
+        <w:rPr>
+          <w:b w:val="0"/>
+          <w:color w:val="7F7F7F"/>
+          <w:sz w:val="16"/>
+        </w:rPr>
+        <w:t xml:space="preserve">   · slide 15 of 19</w:t>
+      </w:r>
+    </w:p>
+    <w:p>
+      <w:pPr>
+        <w:keepNext/>
+        <w:pBdr>
+          <w:left w:val="double" w:sz="12" w:space="8" w:color="B45309"/>
+        </w:pBdr>
+        <w:spacing w:before="0" w:after="60"/>
+      </w:pPr>
+      <w:r>
+        <w:rPr>
+          <w:b/>
+          <w:color w:val="6B8E3F"/>
+          <w:sz w:val="18"/>
+        </w:rPr>
+        <w:t xml:space="preserve">E7 · 8:16–8:19 · </w:t>
+      </w:r>
+      <w:r>
+        <w:rPr>
+          <w:b/>
+          <w:color w:val="B45309"/>
+          <w:sz w:val="18"/>
+        </w:rPr>
+        <w:t>LEAD: CONTENT PRESENTER</w:t>
+      </w:r>
+      <w:r>
+        <w:rPr>
+          <w:b/>
+          <w:color w:val="6B8E3F"/>
+          <w:sz w:val="18"/>
+        </w:rPr>
+      </w:r>
+    </w:p>
+    <w:p>
+      <w:pPr>
+        <w:pBdr>
+          <w:left w:val="double" w:sz="12" w:space="8" w:color="B45309"/>
+        </w:pBdr>
+        <w:spacing w:before="0" w:after="60"/>
+      </w:pPr>
+      <w:r>
+        <w:rPr>
+          <w:b/>
+          <w:color w:val="595959"/>
+        </w:rPr>
+        <w:t xml:space="preserve">BEATS: </w:t>
+      </w:r>
+      <w:r>
+        <w:t>1. Name the gap plainly: no evening over Thanksgiving week; four weeks to Tuesday, December 8. "See you in a couple of weeks" is how practices die. 2. Weeks one and two run as always: the garden returns, the check-in after week one. 3. Weeks three and four are yours: each week, one practice from The Practices So Far card, a different one in week four; write down which, and why. 4. Read the list once, aloud, so everyone knows the menu. 5. The returning rule: if it slips, begin again the next day; no starting over, no streaks. 6. Name who to reach over the gap. 7. December 8 opens with three questions: which did you choose, did you come back on your own, which would you keep?</w:t>
+      </w:r>
+    </w:p>
+    <w:p>
+      <w:pPr>
+        <w:pBdr>
+          <w:left w:val="double" w:sz="12" w:space="8" w:color="B45309"/>
+        </w:pBdr>
+        <w:spacing w:before="0" w:after="60"/>
+      </w:pPr>
+      <w:r>
+        <w:rPr>
+          <w:b/>
+          <w:color w:val="595959"/>
+        </w:rPr>
+        <w:t xml:space="preserve">GUARD: </w:t>
+      </w:r>
+      <w:r>
+        <w:t>Walk the list; never steer. The choices are made at home, freely: which practices people really want to do is what we are learning (John's word, 28 October).</w:t>
+      </w:r>
+    </w:p>
+    <w:p>
+      <w:pPr>
+        <w:pBdr>
+          <w:left w:val="double" w:sz="12" w:space="8" w:color="B45309"/>
+        </w:pBdr>
+        <w:spacing w:before="0" w:after="60"/>
+      </w:pPr>
+      <w:r>
+        <w:rPr>
+          <w:b/>
+          <w:color w:val="595959"/>
+        </w:rPr>
+        <w:t xml:space="preserve">CUES: </w:t>
+      </w:r>
+      <w:r>
+        <w:t>Hand out The Practices So Far card with the take-home sheet on the next slide.</w:t>
+      </w:r>
+    </w:p>
+    <w:p>
+      <w:pPr>
+        <w:keepNext/>
+        <w:pBdr>
+          <w:left w:val="double" w:sz="12" w:space="8" w:color="B45309"/>
+        </w:pBdr>
+        <w:shd w:val="clear" w:color="auto" w:fill="FCE9D6"/>
+        <w:spacing w:before="160" w:after="40"/>
+      </w:pPr>
+      <w:r>
+        <w:rPr>
+          <w:rFonts w:ascii="Cambria" w:hAnsi="Cambria"/>
+          <w:b/>
+          <w:color w:val="B45309"/>
+          <w:sz w:val="30"/>
+        </w:rPr>
+        <w:t>G16</w:t>
       </w:r>
       <w:r>
         <w:rPr>
@@ -1834,7 +1982,7 @@
           <w:color w:val="7F7F7F"/>
           <w:sz w:val="16"/>
         </w:rPr>
-        <w:t xml:space="preserve">   · slide 15 of 18</w:t>
+        <w:t xml:space="preserve">   · slide 16 of 19</w:t>
       </w:r>
     </w:p>
     <w:p>
@@ -1932,7 +2080,7 @@
         <w:t xml:space="preserve">CUES: </w:t>
       </w:r>
       <w:r>
-        <w:t>The four parts are the next slide.</w:t>
+        <w:t>The five parts are the next slide.</w:t>
       </w:r>
     </w:p>
     <w:p>
@@ -1951,7 +2099,7 @@
           <w:color w:val="B45309"/>
           <w:sz w:val="30"/>
         </w:rPr>
-        <w:t>G16</w:t>
+        <w:t>G17</w:t>
       </w:r>
       <w:r>
         <w:rPr>
@@ -1960,7 +2108,7 @@
           <w:color w:val="2C5F2D"/>
           <w:sz w:val="24"/>
         </w:rPr>
-        <w:t xml:space="preserve">   The Take-Home Sheet — the Four Parts</w:t>
+        <w:t xml:space="preserve">   The Take-Home Sheet — the Five Parts</w:t>
       </w:r>
       <w:r>
         <w:rPr>
@@ -1976,7 +2124,7 @@
           <w:color w:val="7F7F7F"/>
           <w:sz w:val="16"/>
         </w:rPr>
-        <w:t xml:space="preserve">   · slide 16 of 18</w:t>
+        <w:t xml:space="preserve">   · slide 17 of 19</w:t>
       </w:r>
     </w:p>
     <w:p>
@@ -1993,7 +2141,7 @@
           <w:color w:val="6B8E3F"/>
           <w:sz w:val="18"/>
         </w:rPr>
-        <w:t xml:space="preserve">E7 · COMMISSIONING · </w:t>
+        <w:t xml:space="preserve">E7 · COMMISSIONING · 8:19–8:21 · </w:t>
       </w:r>
       <w:r>
         <w:rPr>
@@ -2034,7 +2182,7 @@
         <w:spacing w:before="0" w:after="60"/>
       </w:pPr>
       <w:r>
-        <w:t>1. The four parts, in order: the homework practice, week one; the end-of-week-one check-in; the homework practice, week two; one sentence of preparation.</w:t>
+        <w:t>1. The five parts, in order: week one, the garden returns; the end-of-week-one check-in; week two, the garden again; weeks three and four, your choice from The Practices So Far; two sentences of preparation for December 8.</w:t>
       </w:r>
     </w:p>
     <w:p>
@@ -2045,7 +2193,18 @@
         <w:spacing w:before="0" w:after="60"/>
       </w:pPr>
       <w:r>
-        <w:t>2. Check-in partners are named aloud before leaving this slide — the sheet has the line to write the name.</w:t>
+        <w:t>2. Check-in partners are named aloud before leaving this slide; the sheet has the line to write the name.</w:t>
+      </w:r>
+    </w:p>
+    <w:p>
+      <w:pPr>
+        <w:pBdr>
+          <w:left w:val="double" w:sz="12" w:space="8" w:color="B45309"/>
+        </w:pBdr>
+        <w:spacing w:before="0" w:after="60"/>
+      </w:pPr>
+      <w:r>
+        <w:t>3. The Practices So Far card and the How Did You Know? card go with the sheet.</w:t>
       </w:r>
     </w:p>
     <w:p>
@@ -2082,7 +2241,7 @@
           <w:color w:val="6B3FA0"/>
           <w:sz w:val="30"/>
         </w:rPr>
-        <w:t>G17</w:t>
+        <w:t>G18</w:t>
       </w:r>
       <w:r>
         <w:rPr>
@@ -2107,7 +2266,7 @@
           <w:color w:val="7F7F7F"/>
           <w:sz w:val="16"/>
         </w:rPr>
-        <w:t xml:space="preserve">   · slide 17 of 18</w:t>
+        <w:t xml:space="preserve">   · slide 18 of 19</w:t>
       </w:r>
     </w:p>
     <w:p>
@@ -2176,7 +2335,7 @@
           <w:color w:val="1F4E79"/>
           <w:sz w:val="30"/>
         </w:rPr>
-        <w:t>G18</w:t>
+        <w:t>G19</w:t>
       </w:r>
       <w:r>
         <w:rPr>
@@ -2201,7 +2360,7 @@
           <w:color w:val="7F7F7F"/>
           <w:sz w:val="16"/>
         </w:rPr>
-        <w:t xml:space="preserve">   · slide 18 of 18</w:t>
+        <w:t xml:space="preserve">   · slide 19 of 19</w:t>
       </w:r>
     </w:p>
     <w:p>
@@ -2251,7 +2410,25 @@
         <w:t xml:space="preserve">BEATS: </w:t>
       </w:r>
       <w:r>
-        <w:t>0. Step 4 tonight asks the Four Connects impact question: 'What will you do or say differently?' — one sentence, committed aloud. 1. 'What happened in your pair is yours. Carry it gently — don't debrief it on the way home unless your heart is fully ready.' 2. If something heavy surfaced, reach out — the team is walking with you. 3. Aaronic blessing; see you evenings.</w:t>
+        <w:t>0. Step 4 tonight asks the Four Connects impact question: 'What will you do or say differently?' — one sentence, committed aloud. 1. 'What happened in your pair is yours. Carry it gently — don't debrief it on the way home unless your heart is fully ready.' 2. If something heavy surfaced, reach out — the team is walking with you. 3. Aaronic blessing; see you on Tuesday, December 8.</w:t>
+      </w:r>
+    </w:p>
+    <w:p>
+      <w:pPr>
+        <w:pBdr>
+          <w:left w:val="single" w:sz="24" w:space="8" w:color="1F4E79"/>
+        </w:pBdr>
+        <w:spacing w:before="0" w:after="60"/>
+      </w:pPr>
+      <w:r>
+        <w:rPr>
+          <w:b/>
+          <w:color w:val="595959"/>
+        </w:rPr>
+        <w:t xml:space="preserve">GAP: </w:t>
+      </w:r>
+      <w:r>
+        <w:t>say the date once more, and who to reach over Thanksgiving.</w:t>
       </w:r>
     </w:p>
     <w:p>

</xml_diff>